<commit_message>
[Exception] 예외 처리 하드닝 (OWASP #10) - DefaultExceptionAdvice: 500/catch-all을 일반 메시지+traceId로(fail-closed),   400 파싱 오류 일반화, 내부 로그엔 상세(traceId 연결) - application.properties: server.error.include-*=never (층1 기본 오류 처리기) - SQLi 오류로 500 유발 → 외부 일반화/내부 상세 검증 완료 - docs/security/04_Logging_Hardening: #10 예외 처리 하드닝 섹션 추가
</commit_message>
<xml_diff>
--- a/docs/security/04_Logging_Hardening.docx
+++ b/docs/security/04_Logging_Hardening.docx
@@ -168,7 +168,20 @@
         <w:spacing w:after="50" w:line="264" w:lineRule="auto"/>
       </w:pPr>
       <w:r>
-        <w:t>7. 핵심 요약</w:t>
+        <w:t xml:space="preserve">7. 예외 처리 하드닝 (OWASP #10)</w:t>
+      </w:r>
+    </w:p>
+    <w:p>
+      <w:pPr>
+        <w:pStyle w:val="a4"/>
+        <w:numPr>
+          <w:ilvl w:val="0"/>
+          <w:numId w:val="1"/>
+        </w:numPr>
+        <w:spacing w:after="50" w:line="264" w:lineRule="auto"/>
+      </w:pPr>
+      <w:r>
+        <w:t>8. 핵심 요약</w:t>
       </w:r>
     </w:p>
     <w:p>
@@ -1872,39 +1885,312 @@
           <w:sz w:val="18"/>
           <w:szCs w:val="18"/>
         </w:rPr>
-        <w:t xml:space="preserve">[AUDIT] </w:t>
-      </w:r>
+        <w:t xml:space="preserve">[AUDIT] 로그인 실패 - user=us***@aa.com, reason=BadCredentialsException</w:t>
+      </w:r>
+    </w:p>
+    <w:p>
+      <w:pPr>
+        <w:pBdr>
+          <w:left w:val="single" w:sz="18" w:space="6" w:color="C0C0C0"/>
+          <w:bottom w:val="single" w:sz="4" w:space="3" w:color="D9D9D9"/>
+        </w:pBdr>
+        <w:shd w:val="clear" w:color="auto" w:fill="F4F4F4"/>
+      </w:pPr>
       <w:r>
         <w:rPr>
           <w:rFonts w:ascii="Consolas" w:hAnsi="Consolas"/>
           <w:sz w:val="18"/>
           <w:szCs w:val="18"/>
         </w:rPr>
-        <w:t>로그인</w:t>
-      </w:r>
+        <w:t xml:space="preserve">[AUDIT] 인증 실패(401) - POST /api/userinfos/login from ...::1 : 자격 증명에 실패하였습니다.</w:t>
+      </w:r>
+    </w:p>
+    <w:p>
+      <w:pPr>
+        <w:spacing w:after="70" w:line="272" w:lineRule="auto"/>
+      </w:pPr>
+      <w:r>
+        <w:rPr>
+          <w:b/>
+          <w:bCs/>
+        </w:rPr>
+        <w:t>확인</w:t>
+      </w:r>
+    </w:p>
+    <w:p>
+      <w:pPr>
+        <w:pBdr>
+          <w:top w:val="single" w:sz="4" w:space="3" w:color="D9D9D9"/>
+          <w:left w:val="single" w:sz="18" w:space="6" w:color="C0C0C0"/>
+          <w:bottom w:val="single" w:sz="4" w:space="3" w:color="D9D9D9"/>
+        </w:pBdr>
+        <w:shd w:val="clear" w:color="auto" w:fill="F4F4F4"/>
+      </w:pPr>
       <w:r>
         <w:rPr>
           <w:rFonts w:ascii="Consolas" w:hAnsi="Consolas"/>
           <w:sz w:val="18"/>
           <w:szCs w:val="18"/>
         </w:rPr>
+        <w:t xml:space="preserve">grep -E "로그인 실패|인증 실패" logs/spring.log | tail -2</w:t>
+      </w:r>
+    </w:p>
+    <w:p>
+      <w:pPr>
+        <w:spacing w:after="70" w:line="272" w:lineRule="auto"/>
+      </w:pPr>
+      <w:r>
+        <w:rPr>
+          <w:b/>
+          <w:bCs/>
+          <w:color w:val="2E7D32"/>
+        </w:rPr>
+        <w:t>② 로그인 성공 → HTTP 200 (토큰 발급)</w:t>
+      </w:r>
+    </w:p>
+    <w:p>
+      <w:pPr>
+        <w:spacing w:after="70" w:line="272" w:lineRule="auto"/>
+        <w:rPr>
+          <w:b/>
+          <w:bCs/>
+        </w:rPr>
+      </w:pPr>
+    </w:p>
+    <w:p>
+      <w:pPr>
+        <w:spacing w:after="70" w:line="272" w:lineRule="auto"/>
+      </w:pPr>
+      <w:r>
+        <w:rPr>
+          <w:b/>
+          <w:bCs/>
+        </w:rPr>
+        <w:t>요청</w:t>
+      </w:r>
+    </w:p>
+    <w:p>
+      <w:pPr>
+        <w:pBdr>
+          <w:top w:val="single" w:sz="4" w:space="3" w:color="D9D9D9"/>
+          <w:left w:val="single" w:sz="18" w:space="6" w:color="C0C0C0"/>
+        </w:pBdr>
+        <w:shd w:val="clear" w:color="auto" w:fill="F4F4F4"/>
+      </w:pPr>
+      <w:r>
+        <w:rPr>
+          <w:rFonts w:ascii="Consolas" w:hAnsi="Consolas"/>
+          <w:sz w:val="18"/>
+          <w:szCs w:val="18"/>
+        </w:rPr>
+        <w:t>curl -s -X POST "http://localhost:8080/api/userinfos/login" \</w:t>
+      </w:r>
+    </w:p>
+    <w:p>
+      <w:pPr>
+        <w:pBdr>
+          <w:left w:val="single" w:sz="18" w:space="6" w:color="C0C0C0"/>
+          <w:bottom w:val="single" w:sz="4" w:space="3" w:color="D9D9D9"/>
+        </w:pBdr>
+        <w:shd w:val="clear" w:color="auto" w:fill="F4F4F4"/>
+      </w:pPr>
+      <w:r>
+        <w:rPr>
+          <w:rFonts w:ascii="Consolas" w:hAnsi="Consolas"/>
+          <w:sz w:val="18"/>
+          <w:szCs w:val="18"/>
+        </w:rPr>
+        <w:t xml:space="preserve">  -H "Content-Type: application/json" -d '{"email":"user@aa.com","password":"pwd2"}'</w:t>
+      </w:r>
+    </w:p>
+    <w:p>
+      <w:pPr>
+        <w:spacing w:after="70" w:line="272" w:lineRule="auto"/>
+      </w:pPr>
+      <w:r>
+        <w:rPr>
+          <w:b/>
+          <w:bCs/>
+        </w:rPr>
+        <w:t>출력 로그 (1줄)</w:t>
+      </w:r>
+    </w:p>
+    <w:p>
+      <w:pPr>
+        <w:pBdr>
+          <w:top w:val="single" w:sz="4" w:space="3" w:color="D9D9D9"/>
+          <w:left w:val="single" w:sz="18" w:space="6" w:color="C0C0C0"/>
+          <w:bottom w:val="single" w:sz="4" w:space="3" w:color="D9D9D9"/>
+        </w:pBdr>
+        <w:shd w:val="clear" w:color="auto" w:fill="F4F4F4"/>
+      </w:pPr>
+      <w:r>
+        <w:rPr>
+          <w:rFonts w:ascii="Consolas" w:hAnsi="Consolas"/>
+          <w:sz w:val="18"/>
+          <w:szCs w:val="18"/>
+        </w:rPr>
+        <w:t xml:space="preserve">[AUDIT] 로그인 성공 - user=us***@aa.com</w:t>
+      </w:r>
+    </w:p>
+    <w:p>
+      <w:pPr>
+        <w:spacing w:after="70" w:line="272" w:lineRule="auto"/>
+      </w:pPr>
+      <w:r>
+        <w:rPr>
+          <w:b/>
+          <w:bCs/>
+        </w:rPr>
+        <w:t>확인</w:t>
+      </w:r>
+    </w:p>
+    <w:p>
+      <w:pPr>
+        <w:pBdr>
+          <w:top w:val="single" w:sz="4" w:space="3" w:color="D9D9D9"/>
+          <w:left w:val="single" w:sz="18" w:space="6" w:color="C0C0C0"/>
+          <w:bottom w:val="single" w:sz="4" w:space="3" w:color="D9D9D9"/>
+        </w:pBdr>
+        <w:shd w:val="clear" w:color="auto" w:fill="F4F4F4"/>
+      </w:pPr>
+      <w:r>
+        <w:rPr>
+          <w:rFonts w:ascii="Consolas" w:hAnsi="Consolas"/>
+          <w:sz w:val="18"/>
+          <w:szCs w:val="18"/>
+        </w:rPr>
+        <w:t xml:space="preserve">grep "로그인 성공" logs/spring.log | tail -1</w:t>
+      </w:r>
+    </w:p>
+    <w:p>
+      <w:pPr>
+        <w:spacing w:after="70" w:line="272" w:lineRule="auto"/>
+      </w:pPr>
+      <w:r>
+        <w:rPr>
+          <w:b/>
+          <w:bCs/>
+          <w:color w:val="C00000"/>
+        </w:rPr>
+        <w:t>③ 접근 거부 (user가 admin 프로필) → HTTP 403</w:t>
+      </w:r>
+    </w:p>
+    <w:p>
+      <w:pPr>
+        <w:spacing w:after="70" w:line="272" w:lineRule="auto"/>
+      </w:pPr>
+      <w:r>
+        <w:rPr>
+          <w:b/>
+          <w:bCs/>
+        </w:rPr>
+        <w:t>요청 (</w:t>
+      </w:r>
+      <w:r>
+        <w:rPr>
+          <w:b/>
+          <w:bCs/>
+          <w:color w:val="FF0000"/>
+        </w:rPr>
+        <w:t>TOKEN</w:t>
+      </w:r>
+      <w:r>
+        <w:rPr>
+          <w:rFonts w:hint="eastAsia"/>
+          <w:b/>
+          <w:bCs/>
+          <w:color w:val="FF0000"/>
+        </w:rPr>
+        <w:t>변수의 값은</w:t>
+      </w:r>
+      <w:r>
+        <w:rPr>
+          <w:b/>
+          <w:bCs/>
+          <w:color w:val="FF0000"/>
+        </w:rPr>
+        <w:t xml:space="preserve"> 위 ②에서 받은 </w:t>
+      </w:r>
+      <w:r>
+        <w:rPr>
+          <w:rFonts w:hint="eastAsia"/>
+          <w:b/>
+          <w:bCs/>
+          <w:color w:val="FF0000"/>
+        </w:rPr>
+        <w:t xml:space="preserve">토큰 값을 </w:t>
+      </w:r>
+      <w:r>
+        <w:rPr>
+          <w:b/>
+          <w:bCs/>
+          <w:color w:val="FF0000"/>
+        </w:rPr>
+        <w:t>사용</w:t>
+      </w:r>
+      <w:r>
+        <w:rPr>
+          <w:rFonts w:hint="eastAsia"/>
+          <w:b/>
+          <w:bCs/>
+          <w:color w:val="FF0000"/>
+        </w:rPr>
+        <w:t>해야 합니다.</w:t>
+      </w:r>
+      <w:r>
+        <w:rPr>
+          <w:b/>
+          <w:bCs/>
+          <w:color w:val="FF0000"/>
+        </w:rPr>
         <w:t xml:space="preserve"> </w:t>
       </w:r>
       <w:r>
         <w:rPr>
+          <w:b/>
+          <w:bCs/>
+        </w:rPr>
+        <w:t>)</w:t>
+      </w:r>
+    </w:p>
+    <w:p>
+      <w:pPr>
+        <w:pBdr>
+          <w:top w:val="single" w:sz="4" w:space="3" w:color="D9D9D9"/>
+          <w:left w:val="single" w:sz="18" w:space="6" w:color="C0C0C0"/>
+        </w:pBdr>
+        <w:shd w:val="clear" w:color="auto" w:fill="F4F4F4"/>
+        <w:rPr>
           <w:rFonts w:ascii="Consolas" w:hAnsi="Consolas"/>
           <w:sz w:val="18"/>
           <w:szCs w:val="18"/>
         </w:rPr>
-        <w:t>실패</w:t>
-      </w:r>
+      </w:pPr>
       <w:r>
         <w:rPr>
           <w:rFonts w:ascii="Consolas" w:hAnsi="Consolas"/>
           <w:sz w:val="18"/>
           <w:szCs w:val="18"/>
         </w:rPr>
-        <w:t xml:space="preserve"> - user=us***@aa.com, reason=BadCredentialsException</w:t>
+        <w:t>TOKEN=eyJhbGciOiJIUz</w:t>
+      </w:r>
+    </w:p>
+    <w:p>
+      <w:pPr>
+        <w:pBdr>
+          <w:top w:val="single" w:sz="4" w:space="3" w:color="D9D9D9"/>
+          <w:left w:val="single" w:sz="18" w:space="6" w:color="C0C0C0"/>
+        </w:pBdr>
+        <w:shd w:val="clear" w:color="auto" w:fill="F4F4F4"/>
+      </w:pPr>
+      <w:r>
+        <w:rPr>
+          <w:rFonts w:ascii="Consolas" w:hAnsi="Consolas"/>
+          <w:sz w:val="18"/>
+          <w:szCs w:val="18"/>
+        </w:rPr>
+        <w:t>curl -s -o /dev/null -H "Authorization: Bearer $TOKEN" \</w:t>
       </w:r>
     </w:p>
     <w:p>
@@ -1921,759 +2207,68 @@
           <w:sz w:val="18"/>
           <w:szCs w:val="18"/>
         </w:rPr>
-        <w:t xml:space="preserve">[AUDIT] </w:t>
-      </w:r>
+        <w:t xml:space="preserve">  "http://localhost:8080/api/idor/profiles-safe/1"</w:t>
+      </w:r>
+    </w:p>
+    <w:p>
+      <w:pPr>
+        <w:spacing w:after="70" w:line="272" w:lineRule="auto"/>
+      </w:pPr>
+      <w:r>
+        <w:rPr>
+          <w:b/>
+          <w:bCs/>
+        </w:rPr>
+        <w:t>출력 로그 (1줄)</w:t>
+      </w:r>
+    </w:p>
+    <w:p>
+      <w:pPr>
+        <w:pBdr>
+          <w:top w:val="single" w:sz="4" w:space="3" w:color="D9D9D9"/>
+          <w:left w:val="single" w:sz="18" w:space="6" w:color="C0C0C0"/>
+          <w:bottom w:val="single" w:sz="4" w:space="3" w:color="D9D9D9"/>
+        </w:pBdr>
+        <w:shd w:val="clear" w:color="auto" w:fill="F4F4F4"/>
+      </w:pPr>
       <w:r>
         <w:rPr>
           <w:rFonts w:ascii="Consolas" w:hAnsi="Consolas"/>
           <w:sz w:val="18"/>
           <w:szCs w:val="18"/>
         </w:rPr>
-        <w:t>인증</w:t>
-      </w:r>
+        <w:t xml:space="preserve">[AUDIT] 접근 거부(403) - GET /api/idor/profiles-safe/1 from ...::1 : 본인 또는 관리자만 조회할 수 있습니다</w:t>
+      </w:r>
+    </w:p>
+    <w:p>
+      <w:pPr>
+        <w:spacing w:after="70" w:line="272" w:lineRule="auto"/>
+      </w:pPr>
+      <w:r>
+        <w:rPr>
+          <w:b/>
+          <w:bCs/>
+        </w:rPr>
+        <w:t>확인</w:t>
+      </w:r>
+    </w:p>
+    <w:p>
+      <w:pPr>
+        <w:pBdr>
+          <w:top w:val="single" w:sz="4" w:space="3" w:color="D9D9D9"/>
+          <w:left w:val="single" w:sz="18" w:space="6" w:color="C0C0C0"/>
+          <w:bottom w:val="single" w:sz="4" w:space="3" w:color="D9D9D9"/>
+        </w:pBdr>
+        <w:shd w:val="clear" w:color="auto" w:fill="F4F4F4"/>
+      </w:pPr>
+      <w:bookmarkStart w:id="0" w:name="_GoBack"/>
       <w:r>
         <w:rPr>
           <w:rFonts w:ascii="Consolas" w:hAnsi="Consolas"/>
           <w:sz w:val="18"/>
           <w:szCs w:val="18"/>
         </w:rPr>
-        <w:t xml:space="preserve"> </w:t>
-      </w:r>
-      <w:r>
-        <w:rPr>
-          <w:rFonts w:ascii="Consolas" w:hAnsi="Consolas"/>
-          <w:sz w:val="18"/>
-          <w:szCs w:val="18"/>
-        </w:rPr>
-        <w:t>실패</w:t>
-      </w:r>
-      <w:r>
-        <w:rPr>
-          <w:rFonts w:ascii="Consolas" w:hAnsi="Consolas"/>
-          <w:sz w:val="18"/>
-          <w:szCs w:val="18"/>
-        </w:rPr>
-        <w:t xml:space="preserve">(401) - POST /api/userinfos/login from ...::1 : </w:t>
-      </w:r>
-      <w:r>
-        <w:rPr>
-          <w:rFonts w:ascii="Consolas" w:hAnsi="Consolas"/>
-          <w:sz w:val="18"/>
-          <w:szCs w:val="18"/>
-        </w:rPr>
-        <w:t>자격</w:t>
-      </w:r>
-      <w:r>
-        <w:rPr>
-          <w:rFonts w:ascii="Consolas" w:hAnsi="Consolas"/>
-          <w:sz w:val="18"/>
-          <w:szCs w:val="18"/>
-        </w:rPr>
-        <w:t xml:space="preserve"> </w:t>
-      </w:r>
-      <w:r>
-        <w:rPr>
-          <w:rFonts w:ascii="Consolas" w:hAnsi="Consolas"/>
-          <w:sz w:val="18"/>
-          <w:szCs w:val="18"/>
-        </w:rPr>
-        <w:t>증명에</w:t>
-      </w:r>
-      <w:r>
-        <w:rPr>
-          <w:rFonts w:ascii="Consolas" w:hAnsi="Consolas"/>
-          <w:sz w:val="18"/>
-          <w:szCs w:val="18"/>
-        </w:rPr>
-        <w:t xml:space="preserve"> </w:t>
-      </w:r>
-      <w:r>
-        <w:rPr>
-          <w:rFonts w:ascii="Consolas" w:hAnsi="Consolas"/>
-          <w:sz w:val="18"/>
-          <w:szCs w:val="18"/>
-        </w:rPr>
-        <w:t>실패하였습니다</w:t>
-      </w:r>
-      <w:r>
-        <w:rPr>
-          <w:rFonts w:ascii="Consolas" w:hAnsi="Consolas"/>
-          <w:sz w:val="18"/>
-          <w:szCs w:val="18"/>
-        </w:rPr>
-        <w:t>.</w:t>
-      </w:r>
-    </w:p>
-    <w:p>
-      <w:pPr>
-        <w:spacing w:after="70" w:line="272" w:lineRule="auto"/>
-      </w:pPr>
-      <w:r>
-        <w:rPr>
-          <w:b/>
-          <w:bCs/>
-        </w:rPr>
-        <w:t>확인</w:t>
-      </w:r>
-    </w:p>
-    <w:p>
-      <w:pPr>
-        <w:pBdr>
-          <w:top w:val="single" w:sz="4" w:space="3" w:color="D9D9D9"/>
-          <w:left w:val="single" w:sz="18" w:space="6" w:color="C0C0C0"/>
-          <w:bottom w:val="single" w:sz="4" w:space="3" w:color="D9D9D9"/>
-        </w:pBdr>
-        <w:shd w:val="clear" w:color="auto" w:fill="F4F4F4"/>
-      </w:pPr>
-      <w:r>
-        <w:rPr>
-          <w:rFonts w:ascii="Consolas" w:hAnsi="Consolas"/>
-          <w:sz w:val="18"/>
-          <w:szCs w:val="18"/>
-        </w:rPr>
-        <w:t>grep -E "</w:t>
-      </w:r>
-      <w:r>
-        <w:rPr>
-          <w:rFonts w:ascii="Consolas" w:hAnsi="Consolas"/>
-          <w:sz w:val="18"/>
-          <w:szCs w:val="18"/>
-        </w:rPr>
-        <w:t>로그인</w:t>
-      </w:r>
-      <w:r>
-        <w:rPr>
-          <w:rFonts w:ascii="Consolas" w:hAnsi="Consolas"/>
-          <w:sz w:val="18"/>
-          <w:szCs w:val="18"/>
-        </w:rPr>
-        <w:t xml:space="preserve"> </w:t>
-      </w:r>
-      <w:r>
-        <w:rPr>
-          <w:rFonts w:ascii="Consolas" w:hAnsi="Consolas"/>
-          <w:sz w:val="18"/>
-          <w:szCs w:val="18"/>
-        </w:rPr>
-        <w:t>실패</w:t>
-      </w:r>
-      <w:r>
-        <w:rPr>
-          <w:rFonts w:ascii="Consolas" w:hAnsi="Consolas"/>
-          <w:sz w:val="18"/>
-          <w:szCs w:val="18"/>
-        </w:rPr>
-        <w:t>|</w:t>
-      </w:r>
-      <w:r>
-        <w:rPr>
-          <w:rFonts w:ascii="Consolas" w:hAnsi="Consolas"/>
-          <w:sz w:val="18"/>
-          <w:szCs w:val="18"/>
-        </w:rPr>
-        <w:t>인증</w:t>
-      </w:r>
-      <w:r>
-        <w:rPr>
-          <w:rFonts w:ascii="Consolas" w:hAnsi="Consolas"/>
-          <w:sz w:val="18"/>
-          <w:szCs w:val="18"/>
-        </w:rPr>
-        <w:t xml:space="preserve"> </w:t>
-      </w:r>
-      <w:r>
-        <w:rPr>
-          <w:rFonts w:ascii="Consolas" w:hAnsi="Consolas"/>
-          <w:sz w:val="18"/>
-          <w:szCs w:val="18"/>
-        </w:rPr>
-        <w:t>실패</w:t>
-      </w:r>
-      <w:r>
-        <w:rPr>
-          <w:rFonts w:ascii="Consolas" w:hAnsi="Consolas"/>
-          <w:sz w:val="18"/>
-          <w:szCs w:val="18"/>
-        </w:rPr>
-        <w:t>" logs/spring.log | tail -2</w:t>
-      </w:r>
-    </w:p>
-    <w:p>
-      <w:pPr>
-        <w:spacing w:after="70" w:line="272" w:lineRule="auto"/>
-      </w:pPr>
-      <w:r>
-        <w:rPr>
-          <w:b/>
-          <w:bCs/>
-          <w:color w:val="2E7D32"/>
-        </w:rPr>
-        <w:t>② 로그인 성공 → HTTP 200 (토큰 발급)</w:t>
-      </w:r>
-    </w:p>
-    <w:p>
-      <w:pPr>
-        <w:spacing w:after="70" w:line="272" w:lineRule="auto"/>
-        <w:rPr>
-          <w:b/>
-          <w:bCs/>
-        </w:rPr>
-      </w:pPr>
-    </w:p>
-    <w:p>
-      <w:pPr>
-        <w:spacing w:after="70" w:line="272" w:lineRule="auto"/>
-      </w:pPr>
-      <w:r>
-        <w:rPr>
-          <w:b/>
-          <w:bCs/>
-        </w:rPr>
-        <w:t>요청</w:t>
-      </w:r>
-    </w:p>
-    <w:p>
-      <w:pPr>
-        <w:pBdr>
-          <w:top w:val="single" w:sz="4" w:space="3" w:color="D9D9D9"/>
-          <w:left w:val="single" w:sz="18" w:space="6" w:color="C0C0C0"/>
-        </w:pBdr>
-        <w:shd w:val="clear" w:color="auto" w:fill="F4F4F4"/>
-      </w:pPr>
-      <w:r>
-        <w:rPr>
-          <w:rFonts w:ascii="Consolas" w:hAnsi="Consolas"/>
-          <w:sz w:val="18"/>
-          <w:szCs w:val="18"/>
-        </w:rPr>
-        <w:t>curl -s -X POST "http://localhost:8080/api/userinfos/login" \</w:t>
-      </w:r>
-    </w:p>
-    <w:p>
-      <w:pPr>
-        <w:pBdr>
-          <w:left w:val="single" w:sz="18" w:space="6" w:color="C0C0C0"/>
-          <w:bottom w:val="single" w:sz="4" w:space="3" w:color="D9D9D9"/>
-        </w:pBdr>
-        <w:shd w:val="clear" w:color="auto" w:fill="F4F4F4"/>
-      </w:pPr>
-      <w:r>
-        <w:rPr>
-          <w:rFonts w:ascii="Consolas" w:hAnsi="Consolas"/>
-          <w:sz w:val="18"/>
-          <w:szCs w:val="18"/>
-        </w:rPr>
-        <w:t xml:space="preserve">  -H "Content-Type: application/json" -d '{"email":"user@aa.com","password":"pwd2"}'</w:t>
-      </w:r>
-    </w:p>
-    <w:p>
-      <w:pPr>
-        <w:spacing w:after="70" w:line="272" w:lineRule="auto"/>
-      </w:pPr>
-      <w:r>
-        <w:rPr>
-          <w:b/>
-          <w:bCs/>
-        </w:rPr>
-        <w:t>출력 로그 (1줄)</w:t>
-      </w:r>
-    </w:p>
-    <w:p>
-      <w:pPr>
-        <w:pBdr>
-          <w:top w:val="single" w:sz="4" w:space="3" w:color="D9D9D9"/>
-          <w:left w:val="single" w:sz="18" w:space="6" w:color="C0C0C0"/>
-          <w:bottom w:val="single" w:sz="4" w:space="3" w:color="D9D9D9"/>
-        </w:pBdr>
-        <w:shd w:val="clear" w:color="auto" w:fill="F4F4F4"/>
-      </w:pPr>
-      <w:r>
-        <w:rPr>
-          <w:rFonts w:ascii="Consolas" w:hAnsi="Consolas"/>
-          <w:sz w:val="18"/>
-          <w:szCs w:val="18"/>
-        </w:rPr>
-        <w:t xml:space="preserve">[AUDIT] </w:t>
-      </w:r>
-      <w:r>
-        <w:rPr>
-          <w:rFonts w:ascii="Consolas" w:hAnsi="Consolas"/>
-          <w:sz w:val="18"/>
-          <w:szCs w:val="18"/>
-        </w:rPr>
-        <w:t>로그인</w:t>
-      </w:r>
-      <w:r>
-        <w:rPr>
-          <w:rFonts w:ascii="Consolas" w:hAnsi="Consolas"/>
-          <w:sz w:val="18"/>
-          <w:szCs w:val="18"/>
-        </w:rPr>
-        <w:t xml:space="preserve"> </w:t>
-      </w:r>
-      <w:r>
-        <w:rPr>
-          <w:rFonts w:ascii="Consolas" w:hAnsi="Consolas"/>
-          <w:sz w:val="18"/>
-          <w:szCs w:val="18"/>
-        </w:rPr>
-        <w:t>성공</w:t>
-      </w:r>
-      <w:r>
-        <w:rPr>
-          <w:rFonts w:ascii="Consolas" w:hAnsi="Consolas"/>
-          <w:sz w:val="18"/>
-          <w:szCs w:val="18"/>
-        </w:rPr>
-        <w:t xml:space="preserve"> - user=us***@aa.com</w:t>
-      </w:r>
-    </w:p>
-    <w:p>
-      <w:pPr>
-        <w:spacing w:after="70" w:line="272" w:lineRule="auto"/>
-      </w:pPr>
-      <w:r>
-        <w:rPr>
-          <w:b/>
-          <w:bCs/>
-        </w:rPr>
-        <w:t>확인</w:t>
-      </w:r>
-    </w:p>
-    <w:p>
-      <w:pPr>
-        <w:pBdr>
-          <w:top w:val="single" w:sz="4" w:space="3" w:color="D9D9D9"/>
-          <w:left w:val="single" w:sz="18" w:space="6" w:color="C0C0C0"/>
-          <w:bottom w:val="single" w:sz="4" w:space="3" w:color="D9D9D9"/>
-        </w:pBdr>
-        <w:shd w:val="clear" w:color="auto" w:fill="F4F4F4"/>
-      </w:pPr>
-      <w:r>
-        <w:rPr>
-          <w:rFonts w:ascii="Consolas" w:hAnsi="Consolas"/>
-          <w:sz w:val="18"/>
-          <w:szCs w:val="18"/>
-        </w:rPr>
-        <w:t>grep "</w:t>
-      </w:r>
-      <w:r>
-        <w:rPr>
-          <w:rFonts w:ascii="Consolas" w:hAnsi="Consolas"/>
-          <w:sz w:val="18"/>
-          <w:szCs w:val="18"/>
-        </w:rPr>
-        <w:t>로그인</w:t>
-      </w:r>
-      <w:r>
-        <w:rPr>
-          <w:rFonts w:ascii="Consolas" w:hAnsi="Consolas"/>
-          <w:sz w:val="18"/>
-          <w:szCs w:val="18"/>
-        </w:rPr>
-        <w:t xml:space="preserve"> </w:t>
-      </w:r>
-      <w:r>
-        <w:rPr>
-          <w:rFonts w:ascii="Consolas" w:hAnsi="Consolas"/>
-          <w:sz w:val="18"/>
-          <w:szCs w:val="18"/>
-        </w:rPr>
-        <w:t>성공</w:t>
-      </w:r>
-      <w:r>
-        <w:rPr>
-          <w:rFonts w:ascii="Consolas" w:hAnsi="Consolas"/>
-          <w:sz w:val="18"/>
-          <w:szCs w:val="18"/>
-        </w:rPr>
-        <w:t>" logs/spring.log | tail -1</w:t>
-      </w:r>
-    </w:p>
-    <w:p>
-      <w:pPr>
-        <w:spacing w:after="70" w:line="272" w:lineRule="auto"/>
-      </w:pPr>
-      <w:r>
-        <w:rPr>
-          <w:b/>
-          <w:bCs/>
-          <w:color w:val="C00000"/>
-        </w:rPr>
-        <w:t>③ 접근 거부 (user가 admin 프로필) → HTTP 403</w:t>
-      </w:r>
-    </w:p>
-    <w:p>
-      <w:pPr>
-        <w:spacing w:after="70" w:line="272" w:lineRule="auto"/>
-      </w:pPr>
-      <w:r>
-        <w:rPr>
-          <w:b/>
-          <w:bCs/>
-        </w:rPr>
-        <w:t>요청 (</w:t>
-      </w:r>
-      <w:r>
-        <w:rPr>
-          <w:b/>
-          <w:bCs/>
-          <w:color w:val="FF0000"/>
-        </w:rPr>
-        <w:t>TOKEN</w:t>
-      </w:r>
-      <w:r>
-        <w:rPr>
-          <w:rFonts w:hint="eastAsia"/>
-          <w:b/>
-          <w:bCs/>
-          <w:color w:val="FF0000"/>
-        </w:rPr>
-        <w:t>변수의 값은</w:t>
-      </w:r>
-      <w:r>
-        <w:rPr>
-          <w:b/>
-          <w:bCs/>
-          <w:color w:val="FF0000"/>
-        </w:rPr>
-        <w:t xml:space="preserve"> </w:t>
-      </w:r>
-      <w:r>
-        <w:rPr>
-          <w:b/>
-          <w:bCs/>
-          <w:color w:val="FF0000"/>
-        </w:rPr>
-        <w:t>위 ②에서 받은</w:t>
-      </w:r>
-      <w:r>
-        <w:rPr>
-          <w:b/>
-          <w:bCs/>
-          <w:color w:val="FF0000"/>
-        </w:rPr>
-        <w:t xml:space="preserve"> </w:t>
-      </w:r>
-      <w:r>
-        <w:rPr>
-          <w:rFonts w:hint="eastAsia"/>
-          <w:b/>
-          <w:bCs/>
-          <w:color w:val="FF0000"/>
-        </w:rPr>
-        <w:t xml:space="preserve">토큰 값을 </w:t>
-      </w:r>
-      <w:r>
-        <w:rPr>
-          <w:b/>
-          <w:bCs/>
-          <w:color w:val="FF0000"/>
-        </w:rPr>
-        <w:t>사용</w:t>
-      </w:r>
-      <w:r>
-        <w:rPr>
-          <w:rFonts w:hint="eastAsia"/>
-          <w:b/>
-          <w:bCs/>
-          <w:color w:val="FF0000"/>
-        </w:rPr>
-        <w:t>해야 합니다.</w:t>
-      </w:r>
-      <w:r>
-        <w:rPr>
-          <w:b/>
-          <w:bCs/>
-          <w:color w:val="FF0000"/>
-        </w:rPr>
-        <w:t xml:space="preserve"> </w:t>
-      </w:r>
-      <w:r>
-        <w:rPr>
-          <w:b/>
-          <w:bCs/>
-        </w:rPr>
-        <w:t>)</w:t>
-      </w:r>
-    </w:p>
-    <w:p>
-      <w:pPr>
-        <w:pBdr>
-          <w:top w:val="single" w:sz="4" w:space="3" w:color="D9D9D9"/>
-          <w:left w:val="single" w:sz="18" w:space="6" w:color="C0C0C0"/>
-        </w:pBdr>
-        <w:shd w:val="clear" w:color="auto" w:fill="F4F4F4"/>
-        <w:rPr>
-          <w:rFonts w:ascii="Consolas" w:hAnsi="Consolas"/>
-          <w:sz w:val="18"/>
-          <w:szCs w:val="18"/>
-        </w:rPr>
-      </w:pPr>
-      <w:r>
-        <w:rPr>
-          <w:rFonts w:ascii="Consolas" w:hAnsi="Consolas"/>
-          <w:sz w:val="18"/>
-          <w:szCs w:val="18"/>
-        </w:rPr>
-        <w:t>TOKEN=</w:t>
-      </w:r>
-      <w:proofErr w:type="spellStart"/>
-      <w:r>
-        <w:rPr>
-          <w:rFonts w:ascii="Consolas" w:hAnsi="Consolas"/>
-          <w:sz w:val="18"/>
-          <w:szCs w:val="18"/>
-        </w:rPr>
-        <w:t>eyJhbGciOiJIUz</w:t>
-      </w:r>
-      <w:proofErr w:type="spellEnd"/>
-    </w:p>
-    <w:p>
-      <w:pPr>
-        <w:pBdr>
-          <w:top w:val="single" w:sz="4" w:space="3" w:color="D9D9D9"/>
-          <w:left w:val="single" w:sz="18" w:space="6" w:color="C0C0C0"/>
-        </w:pBdr>
-        <w:shd w:val="clear" w:color="auto" w:fill="F4F4F4"/>
-      </w:pPr>
-      <w:r>
-        <w:rPr>
-          <w:rFonts w:ascii="Consolas" w:hAnsi="Consolas"/>
-          <w:sz w:val="18"/>
-          <w:szCs w:val="18"/>
-        </w:rPr>
-        <w:t>curl -s -o /dev/null -H "Authorization: Bearer $TOKEN" \</w:t>
-      </w:r>
-    </w:p>
-    <w:p>
-      <w:pPr>
-        <w:pBdr>
-          <w:left w:val="single" w:sz="18" w:space="6" w:color="C0C0C0"/>
-          <w:bottom w:val="single" w:sz="4" w:space="3" w:color="D9D9D9"/>
-        </w:pBdr>
-        <w:shd w:val="clear" w:color="auto" w:fill="F4F4F4"/>
-      </w:pPr>
-      <w:r>
-        <w:rPr>
-          <w:rFonts w:ascii="Consolas" w:hAnsi="Consolas"/>
-          <w:sz w:val="18"/>
-          <w:szCs w:val="18"/>
-        </w:rPr>
-        <w:t xml:space="preserve">  "http://localhost:8080/api/idor/profiles-safe/1"</w:t>
-      </w:r>
-    </w:p>
-    <w:p>
-      <w:pPr>
-        <w:spacing w:after="70" w:line="272" w:lineRule="auto"/>
-      </w:pPr>
-      <w:r>
-        <w:rPr>
-          <w:b/>
-          <w:bCs/>
-        </w:rPr>
-        <w:t>출력 로그 (1줄)</w:t>
-      </w:r>
-    </w:p>
-    <w:p>
-      <w:pPr>
-        <w:pBdr>
-          <w:top w:val="single" w:sz="4" w:space="3" w:color="D9D9D9"/>
-          <w:left w:val="single" w:sz="18" w:space="6" w:color="C0C0C0"/>
-          <w:bottom w:val="single" w:sz="4" w:space="3" w:color="D9D9D9"/>
-        </w:pBdr>
-        <w:shd w:val="clear" w:color="auto" w:fill="F4F4F4"/>
-      </w:pPr>
-      <w:r>
-        <w:rPr>
-          <w:rFonts w:ascii="Consolas" w:hAnsi="Consolas"/>
-          <w:sz w:val="18"/>
-          <w:szCs w:val="18"/>
-        </w:rPr>
-        <w:t xml:space="preserve">[AUDIT] </w:t>
-      </w:r>
-      <w:r>
-        <w:rPr>
-          <w:rFonts w:ascii="Consolas" w:hAnsi="Consolas"/>
-          <w:sz w:val="18"/>
-          <w:szCs w:val="18"/>
-        </w:rPr>
-        <w:t>접근</w:t>
-      </w:r>
-      <w:r>
-        <w:rPr>
-          <w:rFonts w:ascii="Consolas" w:hAnsi="Consolas"/>
-          <w:sz w:val="18"/>
-          <w:szCs w:val="18"/>
-        </w:rPr>
-        <w:t xml:space="preserve"> </w:t>
-      </w:r>
-      <w:r>
-        <w:rPr>
-          <w:rFonts w:ascii="Consolas" w:hAnsi="Consolas"/>
-          <w:sz w:val="18"/>
-          <w:szCs w:val="18"/>
-        </w:rPr>
-        <w:t>거부</w:t>
-      </w:r>
-      <w:r>
-        <w:rPr>
-          <w:rFonts w:ascii="Consolas" w:hAnsi="Consolas"/>
-          <w:sz w:val="18"/>
-          <w:szCs w:val="18"/>
-        </w:rPr>
-        <w:t xml:space="preserve">(403) - GET /api/idor/profiles-safe/1 from ...::1 : </w:t>
-      </w:r>
-      <w:r>
-        <w:rPr>
-          <w:rFonts w:ascii="Consolas" w:hAnsi="Consolas"/>
-          <w:sz w:val="18"/>
-          <w:szCs w:val="18"/>
-        </w:rPr>
-        <w:t>본인</w:t>
-      </w:r>
-      <w:r>
-        <w:rPr>
-          <w:rFonts w:ascii="Consolas" w:hAnsi="Consolas"/>
-          <w:sz w:val="18"/>
-          <w:szCs w:val="18"/>
-        </w:rPr>
-        <w:t xml:space="preserve"> </w:t>
-      </w:r>
-      <w:r>
-        <w:rPr>
-          <w:rFonts w:ascii="Consolas" w:hAnsi="Consolas"/>
-          <w:sz w:val="18"/>
-          <w:szCs w:val="18"/>
-        </w:rPr>
-        <w:t>또는</w:t>
-      </w:r>
-      <w:r>
-        <w:rPr>
-          <w:rFonts w:ascii="Consolas" w:hAnsi="Consolas"/>
-          <w:sz w:val="18"/>
-          <w:szCs w:val="18"/>
-        </w:rPr>
-        <w:t xml:space="preserve"> </w:t>
-      </w:r>
-      <w:r>
-        <w:rPr>
-          <w:rFonts w:ascii="Consolas" w:hAnsi="Consolas"/>
-          <w:sz w:val="18"/>
-          <w:szCs w:val="18"/>
-        </w:rPr>
-        <w:t>관리자만</w:t>
-      </w:r>
-      <w:r>
-        <w:rPr>
-          <w:rFonts w:ascii="Consolas" w:hAnsi="Consolas"/>
-          <w:sz w:val="18"/>
-          <w:szCs w:val="18"/>
-        </w:rPr>
-        <w:t xml:space="preserve"> </w:t>
-      </w:r>
-      <w:r>
-        <w:rPr>
-          <w:rFonts w:ascii="Consolas" w:hAnsi="Consolas"/>
-          <w:sz w:val="18"/>
-          <w:szCs w:val="18"/>
-        </w:rPr>
-        <w:t>조회할</w:t>
-      </w:r>
-      <w:r>
-        <w:rPr>
-          <w:rFonts w:ascii="Consolas" w:hAnsi="Consolas"/>
-          <w:sz w:val="18"/>
-          <w:szCs w:val="18"/>
-        </w:rPr>
-        <w:t xml:space="preserve"> </w:t>
-      </w:r>
-      <w:r>
-        <w:rPr>
-          <w:rFonts w:ascii="Consolas" w:hAnsi="Consolas"/>
-          <w:sz w:val="18"/>
-          <w:szCs w:val="18"/>
-        </w:rPr>
-        <w:t>수</w:t>
-      </w:r>
-      <w:r>
-        <w:rPr>
-          <w:rFonts w:ascii="Consolas" w:hAnsi="Consolas"/>
-          <w:sz w:val="18"/>
-          <w:szCs w:val="18"/>
-        </w:rPr>
-        <w:t xml:space="preserve"> </w:t>
-      </w:r>
-      <w:r>
-        <w:rPr>
-          <w:rFonts w:ascii="Consolas" w:hAnsi="Consolas"/>
-          <w:sz w:val="18"/>
-          <w:szCs w:val="18"/>
-        </w:rPr>
-        <w:t>있습니다</w:t>
-      </w:r>
-    </w:p>
-    <w:p>
-      <w:pPr>
-        <w:spacing w:after="70" w:line="272" w:lineRule="auto"/>
-      </w:pPr>
-      <w:r>
-        <w:rPr>
-          <w:b/>
-          <w:bCs/>
-        </w:rPr>
-        <w:t>확인</w:t>
-      </w:r>
-    </w:p>
-    <w:p>
-      <w:pPr>
-        <w:pBdr>
-          <w:top w:val="single" w:sz="4" w:space="3" w:color="D9D9D9"/>
-          <w:left w:val="single" w:sz="18" w:space="6" w:color="C0C0C0"/>
-          <w:bottom w:val="single" w:sz="4" w:space="3" w:color="D9D9D9"/>
-        </w:pBdr>
-        <w:shd w:val="clear" w:color="auto" w:fill="F4F4F4"/>
-      </w:pPr>
-      <w:bookmarkStart w:id="0" w:name="_GoBack"/>
-      <w:r>
-        <w:rPr>
-          <w:rFonts w:ascii="Consolas" w:hAnsi="Consolas"/>
-          <w:sz w:val="18"/>
-          <w:szCs w:val="18"/>
-        </w:rPr>
-        <w:t>grep "</w:t>
-      </w:r>
-      <w:r>
-        <w:rPr>
-          <w:rFonts w:ascii="Consolas" w:hAnsi="Consolas"/>
-          <w:sz w:val="18"/>
-          <w:szCs w:val="18"/>
-        </w:rPr>
-        <w:t>접근</w:t>
-      </w:r>
-      <w:r>
-        <w:rPr>
-          <w:rFonts w:ascii="Consolas" w:hAnsi="Consolas"/>
-          <w:sz w:val="18"/>
-          <w:szCs w:val="18"/>
-        </w:rPr>
-        <w:t xml:space="preserve"> </w:t>
-      </w:r>
-      <w:r>
-        <w:rPr>
-          <w:rFonts w:ascii="Consolas" w:hAnsi="Consolas"/>
-          <w:sz w:val="18"/>
-          <w:szCs w:val="18"/>
-        </w:rPr>
-        <w:t>거부</w:t>
-      </w:r>
-      <w:r>
-        <w:rPr>
-          <w:rFonts w:ascii="Consolas" w:hAnsi="Consolas"/>
-          <w:sz w:val="18"/>
-          <w:szCs w:val="18"/>
-        </w:rPr>
-        <w:t>" logs/spring.log | tail -1</w:t>
+        <w:t xml:space="preserve">grep "접근 거부" logs/spring.log | tail -1</w:t>
       </w:r>
       <w:bookmarkEnd w:id="0"/>
     </w:p>
@@ -2742,7 +2337,453 @@
           <w:bCs/>
           <w:color w:val="1F3864"/>
         </w:rPr>
-        <w:t>7. 핵심 요약</w:t>
+        <w:t xml:space="preserve">7. 예외 처리 하드닝 (OWASP #10)</w:t>
+      </w:r>
+    </w:p>
+    <w:p>
+      <w:pPr>
+        <w:spacing w:after="80" w:line="272" w:lineRule="auto"/>
+      </w:pPr>
+      <w:r>
+        <w:rPr>
+          <w:sz w:val="20"/>
+          <w:szCs w:val="20"/>
+        </w:rPr>
+        <w:t xml:space="preserve">#9(로깅)과 짝을 이루는 #10(예외 상황 처리 미흡) 대응이다. 예외 발생 시 내부 정보를 외부에 노출하지 않고(fail-closed), </w:t>
+      </w:r>
+      <w:r>
+        <w:rPr>
+          <w:b/>
+          <w:bCs/>
+          <w:sz w:val="20"/>
+          <w:szCs w:val="20"/>
+        </w:rPr>
+        <w:t xml:space="preserve">외부엔 일반 메시지+traceId, 내부 로그엔 상세</w:t>
+      </w:r>
+      <w:r>
+        <w:rPr>
+          <w:sz w:val="20"/>
+          <w:szCs w:val="20"/>
+        </w:rPr>
+        <w:t xml:space="preserve">를 남긴다.</w:t>
+      </w:r>
+    </w:p>
+    <w:p>
+      <w:pPr>
+        <w:pStyle w:val="2"/>
+        <w:spacing w:before="240" w:after="100"/>
+      </w:pPr>
+      <w:r>
+        <w:rPr>
+          <w:b/>
+          <w:bCs/>
+          <w:color w:val="2E5496"/>
+        </w:rPr>
+        <w:t xml:space="preserve">7-1. 무엇을 바꿔나</w:t>
+      </w:r>
+    </w:p>
+    <w:p>
+      <w:pPr>
+        <w:spacing w:after="80" w:line="272" w:lineRule="auto"/>
+      </w:pPr>
+      <w:r>
+        <w:rPr>
+          <w:b/>
+          <w:bCs/>
+          <w:sz w:val="20"/>
+          <w:szCs w:val="20"/>
+        </w:rPr>
+        <w:t xml:space="preserve">• </w:t>
+      </w:r>
+      <w:r>
+        <w:rPr>
+          <w:sz w:val="20"/>
+          <w:szCs w:val="20"/>
+        </w:rPr>
+        <w:t xml:space="preserve">500(RuntimeException) → 일반 메시지+traceId (e.getMessage() 숨김)</w:t>
+      </w:r>
+    </w:p>
+    <w:p>
+      <w:pPr>
+        <w:spacing w:after="80" w:line="272" w:lineRule="auto"/>
+      </w:pPr>
+      <w:r>
+        <w:rPr>
+          <w:b/>
+          <w:bCs/>
+          <w:sz w:val="20"/>
+          <w:szCs w:val="20"/>
+        </w:rPr>
+        <w:t xml:space="preserve">• </w:t>
+      </w:r>
+      <w:r>
+        <w:rPr>
+          <w:sz w:val="20"/>
+          <w:szCs w:val="20"/>
+        </w:rPr>
+        <w:t xml:space="preserve">catch-all @ExceptionHandler(Exception.class) → 안 잡힌 예외도 fail-closed 500</w:t>
+      </w:r>
+    </w:p>
+    <w:p>
+      <w:pPr>
+        <w:spacing w:after="80" w:line="272" w:lineRule="auto"/>
+      </w:pPr>
+      <w:r>
+        <w:rPr>
+          <w:b/>
+          <w:bCs/>
+          <w:sz w:val="20"/>
+          <w:szCs w:val="20"/>
+        </w:rPr>
+        <w:t xml:space="preserve">• </w:t>
+      </w:r>
+      <w:r>
+        <w:rPr>
+          <w:sz w:val="20"/>
+          <w:szCs w:val="20"/>
+        </w:rPr>
+        <w:t xml:space="preserve">400 본문 파싱 오류도 일반화(파서 상세 숨김)</w:t>
+      </w:r>
+    </w:p>
+    <w:p>
+      <w:pPr>
+        <w:spacing w:after="80" w:line="272" w:lineRule="auto"/>
+      </w:pPr>
+      <w:r>
+        <w:rPr>
+          <w:b/>
+          <w:bCs/>
+          <w:sz w:val="20"/>
+          <w:szCs w:val="20"/>
+        </w:rPr>
+        <w:t xml:space="preserve">• </w:t>
+      </w:r>
+      <w:r>
+        <w:rPr>
+          <w:sz w:val="20"/>
+          <w:szCs w:val="20"/>
+        </w:rPr>
+        <w:t xml:space="preserve">server.error.include-*=never (층1 기본 오류 처리기 명시)</w:t>
+      </w:r>
+    </w:p>
+    <w:p>
+      <w:pPr>
+        <w:pBdr>
+          <w:top w:val="single" w:sz="4" w:space="3" w:color="D9D9D9"/>
+          <w:left w:val="single" w:sz="18" w:space="6" w:color="C0C0C0"/>
+        </w:pBdr>
+        <w:shd w:val="clear" w:color="auto" w:fill="F4F4F4"/>
+        <w:spacing w:after="0" w:line="240" w:lineRule="auto"/>
+      </w:pPr>
+      <w:r>
+        <w:rPr>
+          <w:rFonts w:ascii="Consolas" w:hAnsi="Consolas"/>
+          <w:sz w:val="18"/>
+          <w:szCs w:val="18"/>
+        </w:rPr>
+        <w:t xml:space="preserve">private ResponseEntity&lt;ErrorObject&gt; internalError(Exception e, HttpServletRequest request) {</w:t>
+      </w:r>
+    </w:p>
+    <w:p>
+      <w:pPr>
+        <w:pBdr>
+          <w:left w:val="single" w:sz="18" w:space="6" w:color="C0C0C0"/>
+        </w:pBdr>
+        <w:shd w:val="clear" w:color="auto" w:fill="F4F4F4"/>
+        <w:spacing w:after="0" w:line="240" w:lineRule="auto"/>
+      </w:pPr>
+      <w:r>
+        <w:rPr>
+          <w:rFonts w:ascii="Consolas" w:hAnsi="Consolas"/>
+          <w:sz w:val="18"/>
+          <w:szCs w:val="18"/>
+        </w:rPr>
+        <w:t xml:space="preserve">    String traceId = newTraceId();</w:t>
+      </w:r>
+    </w:p>
+    <w:p>
+      <w:pPr>
+        <w:pBdr>
+          <w:left w:val="single" w:sz="18" w:space="6" w:color="C0C0C0"/>
+        </w:pBdr>
+        <w:shd w:val="clear" w:color="auto" w:fill="F4F4F4"/>
+        <w:spacing w:after="0" w:line="240" w:lineRule="auto"/>
+      </w:pPr>
+      <w:r>
+        <w:rPr>
+          <w:rFonts w:ascii="Consolas" w:hAnsi="Consolas"/>
+          <w:sz w:val="18"/>
+          <w:szCs w:val="18"/>
+        </w:rPr>
+        <w:t xml:space="preserve">    // 내부 로그: 상세 + traceId</w:t>
+      </w:r>
+    </w:p>
+    <w:p>
+      <w:pPr>
+        <w:pBdr>
+          <w:left w:val="single" w:sz="18" w:space="6" w:color="C0C0C0"/>
+        </w:pBdr>
+        <w:shd w:val="clear" w:color="auto" w:fill="F4F4F4"/>
+        <w:spacing w:after="0" w:line="240" w:lineRule="auto"/>
+      </w:pPr>
+      <w:r>
+        <w:rPr>
+          <w:rFonts w:ascii="Consolas" w:hAnsi="Consolas"/>
+          <w:sz w:val="18"/>
+          <w:szCs w:val="18"/>
+        </w:rPr>
+        <w:t xml:space="preserve">    log.error("[ERROR][{}] {} {} : {}", traceId, request.getMethod(), request.getRequestURI(), e.getMessage(), e);</w:t>
+      </w:r>
+    </w:p>
+    <w:p>
+      <w:pPr>
+        <w:pBdr>
+          <w:left w:val="single" w:sz="18" w:space="6" w:color="C0C0C0"/>
+        </w:pBdr>
+        <w:shd w:val="clear" w:color="auto" w:fill="F4F4F4"/>
+        <w:spacing w:after="0" w:line="240" w:lineRule="auto"/>
+      </w:pPr>
+      <w:r>
+        <w:rPr>
+          <w:rFonts w:ascii="Consolas" w:hAnsi="Consolas"/>
+          <w:sz w:val="18"/>
+          <w:szCs w:val="18"/>
+        </w:rPr>
+        <w:t xml:space="preserve">    // 외부 응답: 일반 메시지 + traceId (내부 메시지 숨김)</w:t>
+      </w:r>
+    </w:p>
+    <w:p>
+      <w:pPr>
+        <w:pBdr>
+          <w:left w:val="single" w:sz="18" w:space="6" w:color="C0C0C0"/>
+        </w:pBdr>
+        <w:shd w:val="clear" w:color="auto" w:fill="F4F4F4"/>
+        <w:spacing w:after="0" w:line="240" w:lineRule="auto"/>
+      </w:pPr>
+      <w:r>
+        <w:rPr>
+          <w:rFonts w:ascii="Consolas" w:hAnsi="Consolas"/>
+          <w:sz w:val="18"/>
+          <w:szCs w:val="18"/>
+        </w:rPr>
+        <w:t xml:space="preserve">    errorObject.setMessage("서버 내부 오류가 발생했습니다. (traceId: " + traceId + ")");</w:t>
+      </w:r>
+    </w:p>
+    <w:p>
+      <w:pPr>
+        <w:pBdr>
+          <w:left w:val="single" w:sz="18" w:space="6" w:color="C0C0C0"/>
+        </w:pBdr>
+        <w:shd w:val="clear" w:color="auto" w:fill="F4F4F4"/>
+        <w:spacing w:after="0" w:line="240" w:lineRule="auto"/>
+      </w:pPr>
+      <w:r>
+        <w:rPr>
+          <w:rFonts w:ascii="Consolas" w:hAnsi="Consolas"/>
+          <w:sz w:val="18"/>
+          <w:szCs w:val="18"/>
+        </w:rPr>
+        <w:t xml:space="preserve">    ...</w:t>
+      </w:r>
+    </w:p>
+    <w:p>
+      <w:pPr>
+        <w:pBdr>
+          <w:left w:val="single" w:sz="18" w:space="6" w:color="C0C0C0"/>
+          <w:bottom w:val="single" w:sz="4" w:space="3" w:color="D9D9D9"/>
+        </w:pBdr>
+        <w:shd w:val="clear" w:color="auto" w:fill="F4F4F4"/>
+        <w:spacing w:after="0" w:line="240" w:lineRule="auto"/>
+      </w:pPr>
+      <w:r>
+        <w:rPr>
+          <w:rFonts w:ascii="Consolas" w:hAnsi="Consolas"/>
+          <w:sz w:val="18"/>
+          <w:szCs w:val="18"/>
+        </w:rPr>
+        <w:t xml:space="preserve">}</w:t>
+      </w:r>
+    </w:p>
+    <w:p>
+      <w:pPr>
+        <w:pStyle w:val="2"/>
+        <w:spacing w:before="240" w:after="100"/>
+      </w:pPr>
+      <w:r>
+        <w:rPr>
+          <w:b/>
+          <w:bCs/>
+          <w:color w:val="2E5496"/>
+        </w:rPr>
+        <w:t xml:space="preserve">7-2. 실습 : 500 오류 하드닝 확인</w:t>
+      </w:r>
+    </w:p>
+    <w:p>
+      <w:pPr>
+        <w:spacing w:after="80" w:line="272" w:lineRule="auto"/>
+      </w:pPr>
+      <w:r>
+        <w:rPr>
+          <w:sz w:val="20"/>
+          <w:szCs w:val="20"/>
+        </w:rPr>
+        <w:t xml:space="preserve">깨진 SQL 페이로드(단일 따옴표)로 500을 유발하고, 외부 응답과 내부 로그를 비교한다.</w:t>
+      </w:r>
+    </w:p>
+    <w:p>
+      <w:pPr>
+        <w:pBdr>
+          <w:top w:val="single" w:sz="4" w:space="3" w:color="D9D9D9"/>
+          <w:left w:val="single" w:sz="18" w:space="6" w:color="C0C0C0"/>
+          <w:bottom w:val="single" w:sz="4" w:space="3" w:color="D9D9D9"/>
+        </w:pBdr>
+        <w:shd w:val="clear" w:color="auto" w:fill="F4F4F4"/>
+        <w:spacing w:after="0" w:line="240" w:lineRule="auto"/>
+      </w:pPr>
+      <w:r>
+        <w:rPr>
+          <w:rFonts w:ascii="Consolas" w:hAnsi="Consolas"/>
+          <w:sz w:val="18"/>
+          <w:szCs w:val="18"/>
+        </w:rPr>
+        <w:t xml:space="preserve">curl -s -w "\n[HTTP %{http_code}]\n" "http://localhost:8080/api/vuln/sqli/students?name=%27"</w:t>
+      </w:r>
+    </w:p>
+    <w:p>
+      <w:pPr>
+        <w:spacing w:after="80" w:line="272" w:lineRule="auto"/>
+      </w:pPr>
+      <w:r>
+        <w:rPr>
+          <w:b/>
+          <w:bCs/>
+          <w:sz w:val="20"/>
+          <w:szCs w:val="20"/>
+          <w:color w:val="2E7D32"/>
+        </w:rPr>
+        <w:t xml:space="preserve">외부 응답 (일반 메시지+traceId)</w:t>
+      </w:r>
+    </w:p>
+    <w:p>
+      <w:pPr>
+        <w:pBdr>
+          <w:top w:val="single" w:sz="4" w:space="3" w:color="D9D9D9"/>
+          <w:left w:val="single" w:sz="18" w:space="6" w:color="C0C0C0"/>
+          <w:bottom w:val="single" w:sz="4" w:space="3" w:color="D9D9D9"/>
+        </w:pBdr>
+        <w:shd w:val="clear" w:color="auto" w:fill="F4F4F4"/>
+        <w:spacing w:after="0" w:line="240" w:lineRule="auto"/>
+      </w:pPr>
+      <w:r>
+        <w:rPr>
+          <w:rFonts w:ascii="Consolas" w:hAnsi="Consolas"/>
+          <w:sz w:val="18"/>
+          <w:szCs w:val="18"/>
+        </w:rPr>
+        <w:t xml:space="preserve">{"statusCode":500,"message":"서버 내부 오류가 발생했습니다. (traceId: 9a51a868)", ...}</w:t>
+      </w:r>
+    </w:p>
+    <w:p>
+      <w:pPr>
+        <w:spacing w:after="80" w:line="272" w:lineRule="auto"/>
+      </w:pPr>
+      <w:r>
+        <w:rPr>
+          <w:b/>
+          <w:bCs/>
+          <w:sz w:val="20"/>
+          <w:szCs w:val="20"/>
+          <w:color w:val="C00000"/>
+        </w:rPr>
+        <w:t xml:space="preserve">내부 로그 (상세 + 동일 traceId)</w:t>
+      </w:r>
+    </w:p>
+    <w:p>
+      <w:pPr>
+        <w:pBdr>
+          <w:top w:val="single" w:sz="4" w:space="3" w:color="D9D9D9"/>
+          <w:left w:val="single" w:sz="18" w:space="6" w:color="C0C0C0"/>
+          <w:bottom w:val="single" w:sz="4" w:space="3" w:color="D9D9D9"/>
+        </w:pBdr>
+        <w:shd w:val="clear" w:color="auto" w:fill="F4F4F4"/>
+        <w:spacing w:after="0" w:line="240" w:lineRule="auto"/>
+      </w:pPr>
+      <w:r>
+        <w:rPr>
+          <w:rFonts w:ascii="Consolas" w:hAnsi="Consolas"/>
+          <w:sz w:val="18"/>
+          <w:szCs w:val="18"/>
+        </w:rPr>
+        <w:t xml:space="preserve">[ERROR][9a51a868] GET /api/vuln/sqli/students : bad SQL grammar [SELECT ... WHERE name LIKE '%'%']</w:t>
+      </w:r>
+    </w:p>
+    <w:p>
+      <w:pPr>
+        <w:spacing w:after="80" w:line="272" w:lineRule="auto"/>
+      </w:pPr>
+      <w:r>
+        <w:rPr>
+          <w:b/>
+          <w:bCs/>
+          <w:sz w:val="20"/>
+          <w:szCs w:val="20"/>
+        </w:rPr>
+        <w:t xml:space="preserve">확인</w:t>
+      </w:r>
+    </w:p>
+    <w:p>
+      <w:pPr>
+        <w:pBdr>
+          <w:top w:val="single" w:sz="4" w:space="3" w:color="D9D9D9"/>
+          <w:left w:val="single" w:sz="18" w:space="6" w:color="C0C0C0"/>
+          <w:bottom w:val="single" w:sz="4" w:space="3" w:color="D9D9D9"/>
+        </w:pBdr>
+        <w:shd w:val="clear" w:color="auto" w:fill="F4F4F4"/>
+        <w:spacing w:after="0" w:line="240" w:lineRule="auto"/>
+      </w:pPr>
+      <w:r>
+        <w:rPr>
+          <w:rFonts w:ascii="Consolas" w:hAnsi="Consolas"/>
+          <w:sz w:val="18"/>
+          <w:szCs w:val="18"/>
+        </w:rPr>
+        <w:t xml:space="preserve">grep "\[ERROR\]" logs/spring.log | tail -1</w:t>
+      </w:r>
+    </w:p>
+    <w:p>
+      <w:pPr>
+        <w:spacing w:after="80" w:line="272" w:lineRule="auto"/>
+      </w:pPr>
+      <w:r>
+        <w:rPr>
+          <w:b/>
+          <w:bCs/>
+          <w:sz w:val="20"/>
+          <w:szCs w:val="20"/>
+          <w:color w:val="1F3864"/>
+        </w:rPr>
+        <w:t xml:space="preserve">핵심 — </w:t>
+      </w:r>
+      <w:r>
+        <w:rPr>
+          <w:sz w:val="20"/>
+          <w:szCs w:val="20"/>
+        </w:rPr>
+        <w:t xml:space="preserve">traceId(9a51a868)로 외부 응답과 내부 로그가 연결되며, 외부엔 SQL 내부 구조가 노출되지 않는다. 하드닝 전엔 e.getMessage()가 응답에 담겨 SQL 오류가 그대로 노출됐다.</w:t>
+      </w:r>
+    </w:p>
+    <w:p>
+      <w:pPr>
+        <w:pStyle w:val="1"/>
+        <w:spacing w:before="320" w:after="160"/>
+      </w:pPr>
+      <w:r>
+        <w:rPr>
+          <w:b/>
+          <w:bCs/>
+          <w:color w:val="1F3864"/>
+        </w:rPr>
+        <w:t>8. 핵심 요약</w:t>
       </w:r>
     </w:p>
     <w:p>

</xml_diff>